<commit_message>
updated the boards risk briefing doc
</commit_message>
<xml_diff>
--- a/public/downloads/ai-risk-board-briefing.docx
+++ b/public/downloads/ai-risk-board-briefing.docx
@@ -50,7 +50,7 @@
           <w:sz w:val="22"/>
           <w:szCs w:val="22"/>
         </w:rPr>
-        <w:t xml:space="preserve">Bottom line</w:t>
+        <w:t xml:space="preserve">Summary</w:t>
       </w:r>
     </w:p>
     <w:p>
@@ -66,7 +66,7 @@
           <w:sz w:val="18"/>
           <w:szCs w:val="18"/>
         </w:rPr>
-        <w:t xml:space="preserve">[Two sentences. Our AI risk is (low / moderate / elevated) and (improving / steady / rising). We need one decision from you today: (the decision).]</w:t>
+        <w:t xml:space="preserve">[Two or three sentences, led by a fact. What changed since last time (for example: AI tools connected to customer systems went from 4 to 11), what worries us most and why, and the one decision we need from you today.]</w:t>
       </w:r>
     </w:p>
     <w:p>
@@ -137,7 +137,7 @@
                 <w:sz w:val="16"/>
                 <w:szCs w:val="16"/>
               </w:rPr>
-              <w:t xml:space="preserve">Category</w:t>
+              <w:t xml:space="preserve">Kind of AI</w:t>
             </w:r>
           </w:p>
         </w:tc>
@@ -205,7 +205,7 @@
                 <w:sz w:val="16"/>
                 <w:szCs w:val="16"/>
               </w:rPr>
-              <w:t xml:space="preserve">Touch customer or sensitive data</w:t>
+              <w:t xml:space="preserve">Can see customer or sensitive data</w:t>
             </w:r>
           </w:p>
         </w:tc>
@@ -239,7 +239,7 @@
                 <w:sz w:val="16"/>
                 <w:szCs w:val="16"/>
               </w:rPr>
-              <w:t xml:space="preserve">Can act without human approval</w:t>
+              <w:t xml:space="preserve">Can act without a person approving (send, change, pay, push code)</w:t>
             </w:r>
           </w:p>
         </w:tc>
@@ -274,7 +274,7 @@
                 <w:sz w:val="18"/>
                 <w:szCs w:val="18"/>
               </w:rPr>
-              <w:t xml:space="preserve">Employee AI tools (chat, coding, writing)</w:t>
+              <w:t xml:space="preserve">Employee AI tools (chat, coding and writing assistants)</w:t>
             </w:r>
           </w:p>
         </w:tc>
@@ -408,7 +408,7 @@
                 <w:sz w:val="18"/>
                 <w:szCs w:val="18"/>
               </w:rPr>
-              <w:t xml:space="preserve">AI features inside vendor products</w:t>
+              <w:t xml:space="preserve">AI features inside software we already pay for</w:t>
             </w:r>
           </w:p>
         </w:tc>
@@ -542,7 +542,7 @@
                 <w:sz w:val="18"/>
                 <w:szCs w:val="18"/>
               </w:rPr>
-              <w:t xml:space="preserve">AI agents and apps we built</w:t>
+              <w:t xml:space="preserve">AI agents and apps our teams built</w:t>
             </w:r>
           </w:p>
         </w:tc>
@@ -676,7 +676,7 @@
                 <w:sz w:val="18"/>
                 <w:szCs w:val="18"/>
               </w:rPr>
-              <w:t xml:space="preserve">AI vendors connected to our systems (OAuth, API keys)</w:t>
+              <w:t xml:space="preserve">Outside AI tools holding a login, API key or token for our accounts</w:t>
             </w:r>
           </w:p>
         </w:tc>
@@ -1835,7 +1835,7 @@
                 <w:sz w:val="18"/>
                 <w:szCs w:val="18"/>
               </w:rPr>
-              <w:t xml:space="preserve">AI tools and integrations inventoried (% of known)</w:t>
+              <w:t xml:space="preserve">AI tools inventoried (% of AI tools and integrations listed)</w:t>
             </w:r>
           </w:p>
         </w:tc>
@@ -1969,7 +1969,7 @@
                 <w:sz w:val="18"/>
                 <w:szCs w:val="18"/>
               </w:rPr>
-              <w:t xml:space="preserve">Integrations with access scopes reviewed in last 90 days</w:t>
+              <w:t xml:space="preserve">Vendor access reviewed (% of AI integrations checked in last 90 days)</w:t>
             </w:r>
           </w:p>
         </w:tc>
@@ -2237,7 +2237,7 @@
                 <w:sz w:val="18"/>
                 <w:szCs w:val="18"/>
               </w:rPr>
-              <w:t xml:space="preserve">Time to revoke all access for one AI vendor</w:t>
+              <w:t xml:space="preserve">Time to cut off all access for one breached AI vendor</w:t>
             </w:r>
           </w:p>
         </w:tc>

</xml_diff>